<commit_message>
Add Web App overview screenshot and confirmed resource names for Task 1.
</commit_message>
<xml_diff>
--- a/task1-azure-cicd/CodeAlpha_Task1_Azure_CICD.docx
+++ b/task1-azure-cicd/CodeAlpha_Task1_Azure_CICD.docx
@@ -117,7 +117,7 @@
         <w:pStyle w:val="ListBullet"/>
       </w:pPr>
       <w:r>
-        <w:t>Resource Group (Web App): codealpha-devops-rg2 — new RG used due to App Service capacity limits</w:t>
+        <w:t>Resource Group (Web App): codealpha-devops-rg2</w:t>
       </w:r>
     </w:p>
     <w:p>
@@ -133,7 +133,15 @@
         <w:pStyle w:val="ListBullet"/>
       </w:pPr>
       <w:r>
-        <w:t>Web App: created via Azure Portal (Publish = Container)</w:t>
+        <w:t>Web App: codealphaweb15128 — Status Running</w:t>
+      </w:r>
+    </w:p>
+    <w:p>
+      <w:pPr>
+        <w:pStyle w:val="ListBullet"/>
+      </w:pPr>
+      <w:r>
+        <w:t>URL: https://codealphaweb15128-bsbfcadraghjg9ft.centralindia-01.azurewebsites.net</w:t>
       </w:r>
     </w:p>
     <w:p>
@@ -146,7 +154,7 @@
     </w:p>
     <w:p>
       <w:r>
-        <w:t>Creating an App Service Plan with Basic B1 in resource group codealpha-devops-rg failed with no available instances. Azure suggested deploying to a new resource group. Creating codealpha-devops-rg2 with Free F1 succeeded.</w:t>
+        <w:t>Basic B1 capacity was unavailable in the first resource group. Creating a new resource group (codealpha-devops-rg2) with Free F1 succeeded.</w:t>
       </w:r>
     </w:p>
     <w:p>
@@ -154,12 +162,7 @@
         <w:pStyle w:val="Heading1"/>
       </w:pPr>
       <w:r>
-        <w:t>4. Screenshot — Web App deployment complete</w:t>
-      </w:r>
-    </w:p>
-    <w:p>
-      <w:r>
-        <w:t>The Azure Portal confirmed a successful Web App deployment in resource group codealpha-devops-rg2.</w:t>
+        <w:t>4. Screenshot — Deployment complete</w:t>
       </w:r>
     </w:p>
     <w:p>
@@ -169,7 +172,7 @@
       <w:r>
         <w:drawing>
           <wp:inline xmlns:a="http://schemas.openxmlformats.org/drawingml/2006/main" xmlns:pic="http://schemas.openxmlformats.org/drawingml/2006/picture">
-            <wp:extent cx="5486400" cy="2469952"/>
+            <wp:extent cx="5303520" cy="2387620"/>
             <wp:docPr id="1" name="Picture 1"/>
             <wp:cNvGraphicFramePr>
               <a:graphicFrameLocks noChangeAspect="1"/>
@@ -190,7 +193,7 @@
                   <pic:spPr>
                     <a:xfrm>
                       <a:off x="0" y="0"/>
-                      <a:ext cx="5486400" cy="2469952"/>
+                      <a:ext cx="5303520" cy="2387620"/>
                     </a:xfrm>
                     <a:prstGeom prst="rect"/>
                   </pic:spPr>
@@ -209,7 +212,7 @@
           <w:i/>
           <w:sz w:val="20"/>
         </w:rPr>
-        <w:t>Figure 1: Deployment complete — Azure for Students · Resource group codealpha-devops-rg2 · 7/26/2026, 4:16:26 PM.</w:t>
+        <w:t>Figure 1: Deployment complete in codealpha-devops-rg2.</w:t>
       </w:r>
     </w:p>
     <w:p>
@@ -217,7 +220,70 @@
         <w:pStyle w:val="Heading1"/>
       </w:pPr>
       <w:r>
-        <w:t>5. Next steps</w:t>
+        <w:t>5. Screenshot — Web App running</w:t>
+      </w:r>
+    </w:p>
+    <w:p>
+      <w:r>
+        <w:t>Overview shows Web App codealphaweb15128 Running in Central India on plan F1, publish model Container.</w:t>
+      </w:r>
+    </w:p>
+    <w:p>
+      <w:pPr>
+        <w:jc w:val="center"/>
+      </w:pPr>
+      <w:r>
+        <w:drawing>
+          <wp:inline xmlns:a="http://schemas.openxmlformats.org/drawingml/2006/main" xmlns:pic="http://schemas.openxmlformats.org/drawingml/2006/picture">
+            <wp:extent cx="5303520" cy="2558534"/>
+            <wp:docPr id="2" name="Picture 2"/>
+            <wp:cNvGraphicFramePr>
+              <a:graphicFrameLocks noChangeAspect="1"/>
+            </wp:cNvGraphicFramePr>
+            <a:graphic>
+              <a:graphicData uri="http://schemas.openxmlformats.org/drawingml/2006/picture">
+                <pic:pic>
+                  <pic:nvPicPr>
+                    <pic:cNvPr id="0" name="02_webapp_overview_running.png"/>
+                    <pic:cNvPicPr/>
+                  </pic:nvPicPr>
+                  <pic:blipFill>
+                    <a:blip r:embed="rId10"/>
+                    <a:stretch>
+                      <a:fillRect/>
+                    </a:stretch>
+                  </pic:blipFill>
+                  <pic:spPr>
+                    <a:xfrm>
+                      <a:off x="0" y="0"/>
+                      <a:ext cx="5303520" cy="2558534"/>
+                    </a:xfrm>
+                    <a:prstGeom prst="rect"/>
+                  </pic:spPr>
+                </pic:pic>
+              </a:graphicData>
+            </a:graphic>
+          </wp:inline>
+        </w:drawing>
+      </w:r>
+    </w:p>
+    <w:p>
+      <w:r>
+        <w:rPr>
+          <w:rFonts w:ascii="Calibri" w:hAnsi="Calibri"/>
+          <w:b w:val="0"/>
+          <w:i/>
+          <w:sz w:val="20"/>
+        </w:rPr>
+        <w:t>Figure 2: codealphaweb15128 — Running · Central India · F1 · Container.</w:t>
+      </w:r>
+    </w:p>
+    <w:p>
+      <w:pPr>
+        <w:pStyle w:val="Heading1"/>
+      </w:pPr>
+      <w:r>
+        <w:t>6. Next steps</w:t>
       </w:r>
     </w:p>
     <w:p>
@@ -225,7 +291,7 @@
         <w:pStyle w:val="ListBullet"/>
       </w:pPr>
       <w:r>
-        <w:t>Confirm Web App name and URL</w:t>
+        <w:t>Create Azure DevOps project and connect GitHub repo CodeAlpha_DevOps</w:t>
       </w:r>
     </w:p>
     <w:p>
@@ -233,7 +299,7 @@
         <w:pStyle w:val="ListBullet"/>
       </w:pPr>
       <w:r>
-        <w:t>Set up Azure DevOps project and connect GitHub repo CodeAlpha_DevOps</w:t>
+        <w:t>Create service connections: acr-connection + CodeAlpha-Azure-Connection</w:t>
       </w:r>
     </w:p>
     <w:p>
@@ -241,15 +307,7 @@
         <w:pStyle w:val="ListBullet"/>
       </w:pPr>
       <w:r>
-        <w:t>Create service connections (ACR + Azure Resource Manager)</w:t>
-      </w:r>
-    </w:p>
-    <w:p>
-      <w:pPr>
-        <w:pStyle w:val="ListBullet"/>
-      </w:pPr>
-      <w:r>
-        <w:t>Run pipeline to build Task 4 Docker image, push to ACR, deploy to App Service</w:t>
+        <w:t>Run pipeline azure-pipelines.simple.yml to build, push to ACR, deploy</w:t>
       </w:r>
     </w:p>
     <w:p>
@@ -257,7 +315,7 @@
         <w:pStyle w:val="Heading1"/>
       </w:pPr>
       <w:r>
-        <w:t>6. Values for pipeline YAML</w:t>
+        <w:t>7. Pipeline values</w:t>
       </w:r>
     </w:p>
     <w:p>
@@ -270,7 +328,7 @@
         <w:br/>
         <w:t>imageName: 'codealpha-webserver'</w:t>
         <w:br/>
-        <w:t>appName: '&lt;web-app-name&gt;'</w:t>
+        <w:t>appServiceName: 'codealphaweb15128'</w:t>
       </w:r>
     </w:p>
     <w:sectPr>

</xml_diff>

<commit_message>
Add Azure DevOps organization screenshot for Task 1 progress.
</commit_message>
<xml_diff>
--- a/task1-azure-cicd/CodeAlpha_Task1_Azure_CICD.docx
+++ b/task1-azure-cicd/CodeAlpha_Task1_Azure_CICD.docx
@@ -76,6 +76,17 @@
       </w:r>
     </w:p>
     <w:p>
+      <w:r>
+        <w:rPr>
+          <w:rFonts w:ascii="Calibri" w:hAnsi="Calibri"/>
+          <w:b w:val="0"/>
+          <w:i w:val="0"/>
+          <w:sz w:val="22"/>
+        </w:rPr>
+        <w:t>Azure DevOps org: musfira-codealpha</w:t>
+      </w:r>
+    </w:p>
+    <w:p>
       <w:pPr>
         <w:pStyle w:val="Heading1"/>
       </w:pPr>
@@ -85,7 +96,7 @@
     </w:p>
     <w:p>
       <w:r>
-        <w:t>Build an automated CI/CD pipeline with Azure Pipelines, store container images in Azure Container Registry (ACR), and deploy a web app to Azure App Service.</w:t>
+        <w:t>Build an automated CI/CD pipeline with Azure Pipelines, store images in ACR, and deploy to Azure App Service.</w:t>
       </w:r>
     </w:p>
     <w:p>
@@ -93,7 +104,7 @@
         <w:pStyle w:val="Heading1"/>
       </w:pPr>
       <w:r>
-        <w:t>2. Azure resources created</w:t>
+        <w:t>2. Azure resources</w:t>
       </w:r>
     </w:p>
     <w:p>
@@ -101,7 +112,7 @@
         <w:pStyle w:val="ListBullet"/>
       </w:pPr>
       <w:r>
-        <w:t>Resource Group (ACR): codealpha-devops-rg — Central India</w:t>
+        <w:t>ACR: codealphacr15128.azurecr.io (RG codealpha-devops-rg)</w:t>
       </w:r>
     </w:p>
     <w:p>
@@ -109,31 +120,7 @@
         <w:pStyle w:val="ListBullet"/>
       </w:pPr>
       <w:r>
-        <w:t>Azure Container Registry: codealphacr15128 (codealphacr15128.azurecr.io), Admin enabled</w:t>
-      </w:r>
-    </w:p>
-    <w:p>
-      <w:pPr>
-        <w:pStyle w:val="ListBullet"/>
-      </w:pPr>
-      <w:r>
-        <w:t>Resource Group (Web App): codealpha-devops-rg2</w:t>
-      </w:r>
-    </w:p>
-    <w:p>
-      <w:pPr>
-        <w:pStyle w:val="ListBullet"/>
-      </w:pPr>
-      <w:r>
-        <w:t>App Service Plan: ASP-codealphadevopsrg2-9b83 — Linux, Free F1, Central India</w:t>
-      </w:r>
-    </w:p>
-    <w:p>
-      <w:pPr>
-        <w:pStyle w:val="ListBullet"/>
-      </w:pPr>
-      <w:r>
-        <w:t>Web App: codealphaweb15128 — Status Running</w:t>
+        <w:t>Web App: codealphaweb15128 (RG codealpha-devops-rg2, F1, Running)</w:t>
       </w:r>
     </w:p>
     <w:p>
@@ -146,15 +133,10 @@
     </w:p>
     <w:p>
       <w:pPr>
-        <w:pStyle w:val="Heading1"/>
+        <w:pStyle w:val="ListBullet"/>
       </w:pPr>
       <w:r>
-        <w:t>3. Capacity issue and workaround</w:t>
-      </w:r>
-    </w:p>
-    <w:p>
-      <w:r>
-        <w:t>Basic B1 capacity was unavailable in the first resource group. Creating a new resource group (codealpha-devops-rg2) with Free F1 succeeded.</w:t>
+        <w:t>Azure DevOps org: musfira-codealpha</w:t>
       </w:r>
     </w:p>
     <w:p>
@@ -162,7 +144,7 @@
         <w:pStyle w:val="Heading1"/>
       </w:pPr>
       <w:r>
-        <w:t>4. Screenshot — Deployment complete</w:t>
+        <w:t>3. Screenshots</w:t>
       </w:r>
     </w:p>
     <w:p>
@@ -212,20 +194,7 @@
           <w:i/>
           <w:sz w:val="20"/>
         </w:rPr>
-        <w:t>Figure 1: Deployment complete in codealpha-devops-rg2.</w:t>
-      </w:r>
-    </w:p>
-    <w:p>
-      <w:pPr>
-        <w:pStyle w:val="Heading1"/>
-      </w:pPr>
-      <w:r>
-        <w:t>5. Screenshot — Web App running</w:t>
-      </w:r>
-    </w:p>
-    <w:p>
-      <w:r>
-        <w:t>Overview shows Web App codealphaweb15128 Running in Central India on plan F1, publish model Container.</w:t>
+        <w:t>Figure 1: Web App deployment complete (codealpha-devops-rg2).</w:t>
       </w:r>
     </w:p>
     <w:p>
@@ -275,7 +244,57 @@
           <w:i/>
           <w:sz w:val="20"/>
         </w:rPr>
-        <w:t>Figure 2: codealphaweb15128 — Running · Central India · F1 · Container.</w:t>
+        <w:t>Figure 2: Web App codealphaweb15128 Running in Central India (F1).</w:t>
+      </w:r>
+    </w:p>
+    <w:p>
+      <w:pPr>
+        <w:jc w:val="center"/>
+      </w:pPr>
+      <w:r>
+        <w:drawing>
+          <wp:inline xmlns:a="http://schemas.openxmlformats.org/drawingml/2006/main" xmlns:pic="http://schemas.openxmlformats.org/drawingml/2006/picture">
+            <wp:extent cx="5303520" cy="2558534"/>
+            <wp:docPr id="3" name="Picture 3"/>
+            <wp:cNvGraphicFramePr>
+              <a:graphicFrameLocks noChangeAspect="1"/>
+            </wp:cNvGraphicFramePr>
+            <a:graphic>
+              <a:graphicData uri="http://schemas.openxmlformats.org/drawingml/2006/picture">
+                <pic:pic>
+                  <pic:nvPicPr>
+                    <pic:cNvPr id="0" name="03_azure_devops_create_project.png"/>
+                    <pic:cNvPicPr/>
+                  </pic:nvPicPr>
+                  <pic:blipFill>
+                    <a:blip r:embed="rId11"/>
+                    <a:stretch>
+                      <a:fillRect/>
+                    </a:stretch>
+                  </pic:blipFill>
+                  <pic:spPr>
+                    <a:xfrm>
+                      <a:off x="0" y="0"/>
+                      <a:ext cx="5303520" cy="2558534"/>
+                    </a:xfrm>
+                    <a:prstGeom prst="rect"/>
+                  </pic:spPr>
+                </pic:pic>
+              </a:graphicData>
+            </a:graphic>
+          </wp:inline>
+        </w:drawing>
+      </w:r>
+    </w:p>
+    <w:p>
+      <w:r>
+        <w:rPr>
+          <w:rFonts w:ascii="Calibri" w:hAnsi="Calibri"/>
+          <w:b w:val="0"/>
+          <w:i/>
+          <w:sz w:val="20"/>
+        </w:rPr>
+        <w:t>Figure 3: Azure DevOps organization musfira-codealpha — Create a project.</w:t>
       </w:r>
     </w:p>
     <w:p>
@@ -283,7 +302,7 @@
         <w:pStyle w:val="Heading1"/>
       </w:pPr>
       <w:r>
-        <w:t>6. Next steps</w:t>
+        <w:t>4. Next steps</w:t>
       </w:r>
     </w:p>
     <w:p>
@@ -291,7 +310,7 @@
         <w:pStyle w:val="ListBullet"/>
       </w:pPr>
       <w:r>
-        <w:t>Create Azure DevOps project and connect GitHub repo CodeAlpha_DevOps</w:t>
+        <w:t>Create project CodeAlpha-DevOps</w:t>
       </w:r>
     </w:p>
     <w:p>
@@ -299,7 +318,7 @@
         <w:pStyle w:val="ListBullet"/>
       </w:pPr>
       <w:r>
-        <w:t>Create service connections: acr-connection + CodeAlpha-Azure-Connection</w:t>
+        <w:t>Connect GitHub repo and create pipeline from azure-pipelines.simple.yml</w:t>
       </w:r>
     </w:p>
     <w:p>
@@ -307,28 +326,15 @@
         <w:pStyle w:val="ListBullet"/>
       </w:pPr>
       <w:r>
-        <w:t>Run pipeline azure-pipelines.simple.yml to build, push to ACR, deploy</w:t>
+        <w:t>Add service connections acr-connection and CodeAlpha-Azure-Connection</w:t>
       </w:r>
     </w:p>
     <w:p>
       <w:pPr>
-        <w:pStyle w:val="Heading1"/>
+        <w:pStyle w:val="ListBullet"/>
       </w:pPr>
       <w:r>
-        <w:t>7. Pipeline values</w:t>
-      </w:r>
-    </w:p>
-    <w:p>
-      <w:r>
-        <w:rPr>
-          <w:rFonts w:ascii="Consolas" w:hAnsi="Consolas"/>
-          <w:sz w:val="20"/>
-        </w:rPr>
-        <w:t>acrLoginServer: 'codealphacr15128.azurecr.io'</w:t>
-        <w:br/>
-        <w:t>imageName: 'codealpha-webserver'</w:t>
-        <w:br/>
-        <w:t>appServiceName: 'codealphaweb15128'</w:t>
+        <w:t>Run pipeline (build → ACR → App Service)</w:t>
       </w:r>
     </w:p>
     <w:sectPr>

</xml_diff>

<commit_message>
Add Azure DevOps project home screenshot for Task 1.
</commit_message>
<xml_diff>
--- a/task1-azure-cicd/CodeAlpha_Task1_Azure_CICD.docx
+++ b/task1-azure-cicd/CodeAlpha_Task1_Azure_CICD.docx
@@ -337,6 +337,67 @@
         <w:t>Run pipeline (build → ACR → App Service)</w:t>
       </w:r>
     </w:p>
+    <w:p>
+      <w:pPr>
+        <w:pStyle w:val="Heading1"/>
+      </w:pPr>
+      <w:r>
+        <w:t>Screenshot — Project created</w:t>
+      </w:r>
+    </w:p>
+    <w:p>
+      <w:r>
+        <w:t>Azure DevOps project CodeAlpha-DevOps created under organization musfira-codealpha.</w:t>
+      </w:r>
+    </w:p>
+    <w:p>
+      <w:pPr>
+        <w:jc w:val="center"/>
+      </w:pPr>
+      <w:r>
+        <w:drawing>
+          <wp:inline xmlns:a="http://schemas.openxmlformats.org/drawingml/2006/main" xmlns:pic="http://schemas.openxmlformats.org/drawingml/2006/picture">
+            <wp:extent cx="5303520" cy="2506742"/>
+            <wp:docPr id="4" name="Picture 4"/>
+            <wp:cNvGraphicFramePr>
+              <a:graphicFrameLocks noChangeAspect="1"/>
+            </wp:cNvGraphicFramePr>
+            <a:graphic>
+              <a:graphicData uri="http://schemas.openxmlformats.org/drawingml/2006/picture">
+                <pic:pic>
+                  <pic:nvPicPr>
+                    <pic:cNvPr id="0" name="04_azure_devops_project_home.png"/>
+                    <pic:cNvPicPr/>
+                  </pic:nvPicPr>
+                  <pic:blipFill>
+                    <a:blip r:embed="rId12"/>
+                    <a:stretch>
+                      <a:fillRect/>
+                    </a:stretch>
+                  </pic:blipFill>
+                  <pic:spPr>
+                    <a:xfrm>
+                      <a:off x="0" y="0"/>
+                      <a:ext cx="5303520" cy="2506742"/>
+                    </a:xfrm>
+                    <a:prstGeom prst="rect"/>
+                  </pic:spPr>
+                </pic:pic>
+              </a:graphicData>
+            </a:graphic>
+          </wp:inline>
+        </w:drawing>
+      </w:r>
+    </w:p>
+    <w:p>
+      <w:r>
+        <w:rPr>
+          <w:i/>
+          <w:sz w:val="20"/>
+        </w:rPr>
+        <w:t>Figure 4: Project home — CodeAlpha-DevOps (Private).</w:t>
+      </w:r>
+    </w:p>
     <w:sectPr>
       <w:pgSz w:w="12240" w:h="15840"/>
       <w:pgMar w:top="1080" w:right="1224" w:bottom="1080" w:left="1224" w:header="720" w:footer="720" w:gutter="0"/>

</xml_diff>

<commit_message>
Add Azure Pipelines configure and YAML selection screenshots.
</commit_message>
<xml_diff>
--- a/task1-azure-cicd/CodeAlpha_Task1_Azure_CICD.docx
+++ b/task1-azure-cicd/CodeAlpha_Task1_Azure_CICD.docx
@@ -398,6 +398,118 @@
         <w:t>Figure 4: Project home — CodeAlpha-DevOps (Private).</w:t>
       </w:r>
     </w:p>
+    <w:p>
+      <w:pPr>
+        <w:pStyle w:val="Heading1"/>
+      </w:pPr>
+      <w:r>
+        <w:t>Screenshot — Pipeline configure</w:t>
+      </w:r>
+    </w:p>
+    <w:p>
+      <w:pPr>
+        <w:jc w:val="center"/>
+      </w:pPr>
+      <w:r>
+        <w:drawing>
+          <wp:inline xmlns:a="http://schemas.openxmlformats.org/drawingml/2006/main" xmlns:pic="http://schemas.openxmlformats.org/drawingml/2006/picture">
+            <wp:extent cx="5303520" cy="2429054"/>
+            <wp:docPr id="5" name="Picture 5"/>
+            <wp:cNvGraphicFramePr>
+              <a:graphicFrameLocks noChangeAspect="1"/>
+            </wp:cNvGraphicFramePr>
+            <a:graphic>
+              <a:graphicData uri="http://schemas.openxmlformats.org/drawingml/2006/picture">
+                <pic:pic>
+                  <pic:nvPicPr>
+                    <pic:cNvPr id="0" name="05_pipeline_configure.png"/>
+                    <pic:cNvPicPr/>
+                  </pic:nvPicPr>
+                  <pic:blipFill>
+                    <a:blip r:embed="rId13"/>
+                    <a:stretch>
+                      <a:fillRect/>
+                    </a:stretch>
+                  </pic:blipFill>
+                  <pic:spPr>
+                    <a:xfrm>
+                      <a:off x="0" y="0"/>
+                      <a:ext cx="5303520" cy="2429054"/>
+                    </a:xfrm>
+                    <a:prstGeom prst="rect"/>
+                  </pic:spPr>
+                </pic:pic>
+              </a:graphicData>
+            </a:graphic>
+          </wp:inline>
+        </w:drawing>
+      </w:r>
+    </w:p>
+    <w:p>
+      <w:r>
+        <w:rPr>
+          <w:i/>
+          <w:sz w:val="20"/>
+        </w:rPr>
+        <w:t>Figure 5: Configure pipeline — Existing Azure Pipelines YAML file.</w:t>
+      </w:r>
+    </w:p>
+    <w:p>
+      <w:pPr>
+        <w:pStyle w:val="Heading1"/>
+      </w:pPr>
+      <w:r>
+        <w:t>Screenshot — Select YAML file</w:t>
+      </w:r>
+    </w:p>
+    <w:p>
+      <w:pPr>
+        <w:jc w:val="center"/>
+      </w:pPr>
+      <w:r>
+        <w:drawing>
+          <wp:inline xmlns:a="http://schemas.openxmlformats.org/drawingml/2006/main" xmlns:pic="http://schemas.openxmlformats.org/drawingml/2006/picture">
+            <wp:extent cx="4754880" cy="4583953"/>
+            <wp:docPr id="6" name="Picture 6"/>
+            <wp:cNvGraphicFramePr>
+              <a:graphicFrameLocks noChangeAspect="1"/>
+            </wp:cNvGraphicFramePr>
+            <a:graphic>
+              <a:graphicData uri="http://schemas.openxmlformats.org/drawingml/2006/picture">
+                <pic:pic>
+                  <pic:nvPicPr>
+                    <pic:cNvPr id="0" name="06_select_existing_yaml.png"/>
+                    <pic:cNvPicPr/>
+                  </pic:nvPicPr>
+                  <pic:blipFill>
+                    <a:blip r:embed="rId14"/>
+                    <a:stretch>
+                      <a:fillRect/>
+                    </a:stretch>
+                  </pic:blipFill>
+                  <pic:spPr>
+                    <a:xfrm>
+                      <a:off x="0" y="0"/>
+                      <a:ext cx="4754880" cy="4583953"/>
+                    </a:xfrm>
+                    <a:prstGeom prst="rect"/>
+                  </pic:spPr>
+                </pic:pic>
+              </a:graphicData>
+            </a:graphic>
+          </wp:inline>
+        </w:drawing>
+      </w:r>
+    </w:p>
+    <w:p>
+      <w:r>
+        <w:rPr>
+          <w:i/>
+          <w:sz w:val="20"/>
+        </w:rPr>
+        <w:t>Figure 6: main + /task1-azure-cicd/azure-pipelines.simple.yml</w:t>
+      </w:r>
+    </w:p>
     <w:sectPr>
       <w:pgSz w:w="12240" w:h="15840"/>
       <w:pgMar w:top="1080" w:right="1224" w:bottom="1080" w:left="1224" w:header="720" w:footer="720" w:gutter="0"/>

</xml_diff>

<commit_message>
Add pipeline YAML review screenshot for Task 1 proof.
</commit_message>
<xml_diff>
--- a/task1-azure-cicd/CodeAlpha_Task1_Azure_CICD.docx
+++ b/task1-azure-cicd/CodeAlpha_Task1_Azure_CICD.docx
@@ -510,6 +510,62 @@
         <w:t>Figure 6: main + /task1-azure-cicd/azure-pipelines.simple.yml</w:t>
       </w:r>
     </w:p>
+    <w:p>
+      <w:pPr>
+        <w:pStyle w:val="Heading1"/>
+      </w:pPr>
+      <w:r>
+        <w:t>Screenshot — Review pipeline YAML</w:t>
+      </w:r>
+    </w:p>
+    <w:p>
+      <w:pPr>
+        <w:jc w:val="center"/>
+      </w:pPr>
+      <w:r>
+        <w:drawing>
+          <wp:inline xmlns:a="http://schemas.openxmlformats.org/drawingml/2006/main" xmlns:pic="http://schemas.openxmlformats.org/drawingml/2006/picture">
+            <wp:extent cx="5303520" cy="2636222"/>
+            <wp:docPr id="7" name="Picture 7"/>
+            <wp:cNvGraphicFramePr>
+              <a:graphicFrameLocks noChangeAspect="1"/>
+            </wp:cNvGraphicFramePr>
+            <a:graphic>
+              <a:graphicData uri="http://schemas.openxmlformats.org/drawingml/2006/picture">
+                <pic:pic>
+                  <pic:nvPicPr>
+                    <pic:cNvPr id="0" name="07_pipeline_review_yaml.png"/>
+                    <pic:cNvPicPr/>
+                  </pic:nvPicPr>
+                  <pic:blipFill>
+                    <a:blip r:embed="rId15"/>
+                    <a:stretch>
+                      <a:fillRect/>
+                    </a:stretch>
+                  </pic:blipFill>
+                  <pic:spPr>
+                    <a:xfrm>
+                      <a:off x="0" y="0"/>
+                      <a:ext cx="5303520" cy="2636222"/>
+                    </a:xfrm>
+                    <a:prstGeom prst="rect"/>
+                  </pic:spPr>
+                </pic:pic>
+              </a:graphicData>
+            </a:graphic>
+          </wp:inline>
+        </w:drawing>
+      </w:r>
+    </w:p>
+    <w:p>
+      <w:r>
+        <w:rPr>
+          <w:i/>
+          <w:sz w:val="20"/>
+        </w:rPr>
+        <w:t>Figure 7: Review YAML before run — ACR and App Service names set.</w:t>
+      </w:r>
+    </w:p>
     <w:sectPr>
       <w:pgSz w:w="12240" w:h="15840"/>
       <w:pgMar w:top="1080" w:right="1224" w:bottom="1080" w:left="1224" w:header="720" w:footer="720" w:gutter="0"/>

</xml_diff>

<commit_message>
Document App Service running with ACR image from successful pipeline deploy.
</commit_message>
<xml_diff>
--- a/task1-azure-cicd/CodeAlpha_Task1_Azure_CICD.docx
+++ b/task1-azure-cicd/CodeAlpha_Task1_Azure_CICD.docx
@@ -566,6 +566,107 @@
         <w:t>Figure 7: Review YAML before run — ACR and App Service names set.</w:t>
       </w:r>
     </w:p>
+    <w:p>
+      <w:pPr>
+        <w:pStyle w:val="Heading1"/>
+      </w:pPr>
+      <w:r>
+        <w:t>Screenshot — ACR image deployed to App Service</w:t>
+      </w:r>
+    </w:p>
+    <w:p>
+      <w:r>
+        <w:t>Pipeline successfully updated the Web App container to the ACR image codealphacr15128.azurecr.io/codealpha-webserver:2. App status Running; runtime Issues Detected is typical on Free F1.</w:t>
+      </w:r>
+    </w:p>
+    <w:p>
+      <w:pPr>
+        <w:jc w:val="center"/>
+      </w:pPr>
+      <w:r>
+        <w:drawing>
+          <wp:inline xmlns:a="http://schemas.openxmlformats.org/drawingml/2006/main" xmlns:pic="http://schemas.openxmlformats.org/drawingml/2006/picture">
+            <wp:extent cx="5303520" cy="2688015"/>
+            <wp:docPr id="8" name="Picture 8"/>
+            <wp:cNvGraphicFramePr>
+              <a:graphicFrameLocks noChangeAspect="1"/>
+            </wp:cNvGraphicFramePr>
+            <a:graphic>
+              <a:graphicData uri="http://schemas.openxmlformats.org/drawingml/2006/picture">
+                <pic:pic>
+                  <pic:nvPicPr>
+                    <pic:cNvPr id="0" name="13_webapp_acr_image_deployed.png"/>
+                    <pic:cNvPicPr/>
+                  </pic:nvPicPr>
+                  <pic:blipFill>
+                    <a:blip r:embed="rId16"/>
+                    <a:stretch>
+                      <a:fillRect/>
+                    </a:stretch>
+                  </pic:blipFill>
+                  <pic:spPr>
+                    <a:xfrm>
+                      <a:off x="0" y="0"/>
+                      <a:ext cx="5303520" cy="2688015"/>
+                    </a:xfrm>
+                    <a:prstGeom prst="rect"/>
+                  </pic:spPr>
+                </pic:pic>
+              </a:graphicData>
+            </a:graphic>
+          </wp:inline>
+        </w:drawing>
+      </w:r>
+    </w:p>
+    <w:p>
+      <w:r>
+        <w:rPr>
+          <w:i/>
+          <w:sz w:val="20"/>
+        </w:rPr>
+        <w:t>Figure 13: codealphaweb15128 running with ACR image tag :2.</w:t>
+      </w:r>
+    </w:p>
+    <w:p>
+      <w:pPr>
+        <w:pStyle w:val="Heading1"/>
+      </w:pPr>
+      <w:r>
+        <w:t>Results summary</w:t>
+      </w:r>
+    </w:p>
+    <w:p>
+      <w:pPr>
+        <w:pStyle w:val="ListBullet"/>
+      </w:pPr>
+      <w:r>
+        <w:t>Azure Pipelines CI/CD created and run succeeded</w:t>
+      </w:r>
+    </w:p>
+    <w:p>
+      <w:pPr>
+        <w:pStyle w:val="ListBullet"/>
+      </w:pPr>
+      <w:r>
+        <w:t>Docker image built and pushed to Azure Container Registry</w:t>
+      </w:r>
+    </w:p>
+    <w:p>
+      <w:pPr>
+        <w:pStyle w:val="ListBullet"/>
+      </w:pPr>
+      <w:r>
+        <w:t>App Service configured with ACR image codealpha-webserver:2</w:t>
+      </w:r>
+    </w:p>
+    <w:p>
+      <w:pPr>
+        <w:pStyle w:val="ListBullet"/>
+      </w:pPr>
+      <w:r>
+        <w:t>Free F1 may show runtime Issues Detected / DNS quirks; core Task 1 goals met</w:t>
+      </w:r>
+    </w:p>
     <w:sectPr>
       <w:pgSz w:w="12240" w:h="15840"/>
       <w:pgMar w:top="1080" w:right="1224" w:bottom="1080" w:left="1224" w:header="720" w:footer="720" w:gutter="0"/>

</xml_diff>